<commit_message>
feat: +10 redacciones oficiales validadas (industria, comercio exterior, acuicultura, educación, energía nuclear, infraestructura, reforma del estado, minería, mipymes, pesca) → 18 validadas/208 indicadores; video de presentación en el hero; regenerados docs/PDFs/síntesis/OG
</commit_message>
<xml_diff>
--- a/entregables/plan-100-dias.docx
+++ b/entregables/plan-100-dias.docx
@@ -60,7 +60,7 @@
           <w:color w:val="B8840E"/>
           <w:sz w:val="22"/>
         </w:rPr>
-        <w:t>20 medidas · 6 comisiones</w:t>
+        <w:t>35 medidas · 8 comisiones</w:t>
       </w:r>
     </w:p>
     <w:p/>
@@ -718,6 +718,431 @@
       <w:r>
         <w:rPr>
           <w:rFonts w:ascii="Calibri" w:hAnsi="Calibri"/>
+          <w:b/>
+          <w:i w:val="0"/>
+          <w:color w:val="D91023"/>
+          <w:sz w:val="30"/>
+        </w:rPr>
+        <w:t>MYPE / MIPYMES</w:t>
+      </w:r>
+    </w:p>
+    <w:p>
+      <w:r>
+        <w:rPr>
+          <w:rFonts w:ascii="Calibri" w:hAnsi="Calibri"/>
+          <w:b w:val="0"/>
+          <w:i/>
+          <w:color w:val="5D6B88"/>
+          <w:sz w:val="19"/>
+        </w:rPr>
+        <w:t>Eje: Competitividad</w:t>
+      </w:r>
+    </w:p>
+    <w:p>
+      <w:pPr>
+        <w:pStyle w:val="ListBullet"/>
+      </w:pPr>
+      <w:r>
+        <w:rPr>
+          <w:rFonts w:ascii="Calibri" w:hAnsi="Calibri"/>
+          <w:b w:val="0"/>
+          <w:i w:val="0"/>
+          <w:color w:val="1A2238"/>
+          <w:sz w:val="21"/>
+        </w:rPr>
+        <w:t>Sensibilizar a las MYPE en la importancia de tener un plan de negocios.</w:t>
+      </w:r>
+      <w:r>
+        <w:rPr>
+          <w:rFonts w:ascii="Calibri" w:hAnsi="Calibri"/>
+          <w:b w:val="0"/>
+          <w:i/>
+          <w:color w:val="B8840E"/>
+          <w:sz w:val="17"/>
+        </w:rPr>
+        <w:t xml:space="preserve">  [Programa / sensibilización]</w:t>
+      </w:r>
+    </w:p>
+    <w:p>
+      <w:pPr>
+        <w:pStyle w:val="ListBullet"/>
+      </w:pPr>
+      <w:r>
+        <w:rPr>
+          <w:rFonts w:ascii="Calibri" w:hAnsi="Calibri"/>
+          <w:b w:val="0"/>
+          <w:i w:val="0"/>
+          <w:color w:val="1A2238"/>
+          <w:sz w:val="21"/>
+        </w:rPr>
+        <w:t>Crear programas de formación en planes de negocio desde las municipalidades y gobiernos regionales.</w:t>
+      </w:r>
+      <w:r>
+        <w:rPr>
+          <w:rFonts w:ascii="Calibri" w:hAnsi="Calibri"/>
+          <w:b w:val="0"/>
+          <w:i/>
+          <w:color w:val="B8840E"/>
+          <w:sz w:val="17"/>
+        </w:rPr>
+        <w:t xml:space="preserve">  [Programa / formación]</w:t>
+      </w:r>
+    </w:p>
+    <w:p>
+      <w:pPr>
+        <w:pStyle w:val="ListBullet"/>
+      </w:pPr>
+      <w:r>
+        <w:rPr>
+          <w:rFonts w:ascii="Calibri" w:hAnsi="Calibri"/>
+          <w:b w:val="0"/>
+          <w:i w:val="0"/>
+          <w:color w:val="1A2238"/>
+          <w:sz w:val="21"/>
+        </w:rPr>
+        <w:t>Crear programas y convenios de interacción dinámica entre universidades (egresados experimentados, estudiantes y profesores) y gremios empresariales, impulsados por los gobiernos regionales.</w:t>
+      </w:r>
+      <w:r>
+        <w:rPr>
+          <w:rFonts w:ascii="Calibri" w:hAnsi="Calibri"/>
+          <w:b w:val="0"/>
+          <w:i/>
+          <w:color w:val="B8840E"/>
+          <w:sz w:val="17"/>
+        </w:rPr>
+        <w:t xml:space="preserve">  [Programa / convenio]</w:t>
+      </w:r>
+    </w:p>
+    <w:p>
+      <w:pPr>
+        <w:pStyle w:val="ListBullet"/>
+      </w:pPr>
+      <w:r>
+        <w:rPr>
+          <w:rFonts w:ascii="Calibri" w:hAnsi="Calibri"/>
+          <w:b w:val="0"/>
+          <w:i w:val="0"/>
+          <w:color w:val="1A2238"/>
+          <w:sz w:val="21"/>
+        </w:rPr>
+        <w:t>Crear incubadoras de empresa en las universidades e institutos tecnológicos estatales.</w:t>
+      </w:r>
+      <w:r>
+        <w:rPr>
+          <w:rFonts w:ascii="Calibri" w:hAnsi="Calibri"/>
+          <w:b w:val="0"/>
+          <w:i/>
+          <w:color w:val="B8840E"/>
+          <w:sz w:val="17"/>
+        </w:rPr>
+        <w:t xml:space="preserve">  [Infraestructura / incubadora]</w:t>
+      </w:r>
+    </w:p>
+    <w:p>
+      <w:pPr>
+        <w:pStyle w:val="ListBullet"/>
+      </w:pPr>
+      <w:r>
+        <w:rPr>
+          <w:rFonts w:ascii="Calibri" w:hAnsi="Calibri"/>
+          <w:b w:val="0"/>
+          <w:i w:val="0"/>
+          <w:color w:val="1A2238"/>
+          <w:sz w:val="21"/>
+        </w:rPr>
+        <w:t>Crear programas de profesionalización para empresarios.</w:t>
+      </w:r>
+      <w:r>
+        <w:rPr>
+          <w:rFonts w:ascii="Calibri" w:hAnsi="Calibri"/>
+          <w:b w:val="0"/>
+          <w:i/>
+          <w:color w:val="B8840E"/>
+          <w:sz w:val="17"/>
+        </w:rPr>
+        <w:t xml:space="preserve">  [Programa / capacitación]</w:t>
+      </w:r>
+    </w:p>
+    <w:p/>
+    <w:p>
+      <w:r>
+        <w:rPr>
+          <w:rFonts w:ascii="Calibri" w:hAnsi="Calibri"/>
+          <w:b/>
+          <w:i w:val="0"/>
+          <w:color w:val="D91023"/>
+          <w:sz w:val="30"/>
+        </w:rPr>
+        <w:t>Pesca</w:t>
+      </w:r>
+    </w:p>
+    <w:p>
+      <w:r>
+        <w:rPr>
+          <w:rFonts w:ascii="Calibri" w:hAnsi="Calibri"/>
+          <w:b w:val="0"/>
+          <w:i/>
+          <w:color w:val="5D6B88"/>
+          <w:sz w:val="19"/>
+        </w:rPr>
+        <w:t>Eje: Sostenibilidad y Ambiente</w:t>
+      </w:r>
+    </w:p>
+    <w:p>
+      <w:pPr>
+        <w:pStyle w:val="ListBullet"/>
+      </w:pPr>
+      <w:r>
+        <w:rPr>
+          <w:rFonts w:ascii="Calibri" w:hAnsi="Calibri"/>
+          <w:b w:val="0"/>
+          <w:i w:val="0"/>
+          <w:color w:val="1A2238"/>
+          <w:sz w:val="21"/>
+        </w:rPr>
+        <w:t>Refundar el Ministerio de Pesquería.</w:t>
+      </w:r>
+      <w:r>
+        <w:rPr>
+          <w:rFonts w:ascii="Calibri" w:hAnsi="Calibri"/>
+          <w:b w:val="0"/>
+          <w:i/>
+          <w:color w:val="B8840E"/>
+          <w:sz w:val="17"/>
+        </w:rPr>
+        <w:t xml:space="preserve">  [Reforma institucional]</w:t>
+      </w:r>
+    </w:p>
+    <w:p>
+      <w:pPr>
+        <w:pStyle w:val="ListBullet"/>
+      </w:pPr>
+      <w:r>
+        <w:rPr>
+          <w:rFonts w:ascii="Calibri" w:hAnsi="Calibri"/>
+          <w:b w:val="0"/>
+          <w:i w:val="0"/>
+          <w:color w:val="1A2238"/>
+          <w:sz w:val="21"/>
+        </w:rPr>
+        <w:t>Creación del Instituto Nacional de Acuicultura.</w:t>
+      </w:r>
+      <w:r>
+        <w:rPr>
+          <w:rFonts w:ascii="Calibri" w:hAnsi="Calibri"/>
+          <w:b w:val="0"/>
+          <w:i/>
+          <w:color w:val="B8840E"/>
+          <w:sz w:val="17"/>
+        </w:rPr>
+        <w:t xml:space="preserve">  [Reforma institucional]</w:t>
+      </w:r>
+    </w:p>
+    <w:p>
+      <w:pPr>
+        <w:pStyle w:val="ListBullet"/>
+      </w:pPr>
+      <w:r>
+        <w:rPr>
+          <w:rFonts w:ascii="Calibri" w:hAnsi="Calibri"/>
+          <w:b w:val="0"/>
+          <w:i w:val="0"/>
+          <w:color w:val="1A2238"/>
+          <w:sz w:val="21"/>
+        </w:rPr>
+        <w:t>Fortalecimiento del IMARPE.</w:t>
+      </w:r>
+      <w:r>
+        <w:rPr>
+          <w:rFonts w:ascii="Calibri" w:hAnsi="Calibri"/>
+          <w:b w:val="0"/>
+          <w:i/>
+          <w:color w:val="B8840E"/>
+          <w:sz w:val="17"/>
+        </w:rPr>
+        <w:t xml:space="preserve">  [Reforma institucional]</w:t>
+      </w:r>
+    </w:p>
+    <w:p>
+      <w:pPr>
+        <w:pStyle w:val="ListBullet"/>
+      </w:pPr>
+      <w:r>
+        <w:rPr>
+          <w:rFonts w:ascii="Calibri" w:hAnsi="Calibri"/>
+          <w:b w:val="0"/>
+          <w:i w:val="0"/>
+          <w:color w:val="1A2238"/>
+          <w:sz w:val="21"/>
+        </w:rPr>
+        <w:t>Fortalecer la Autoridad de Seguimiento, Control y Vigilancia del sector.</w:t>
+      </w:r>
+      <w:r>
+        <w:rPr>
+          <w:rFonts w:ascii="Calibri" w:hAnsi="Calibri"/>
+          <w:b w:val="0"/>
+          <w:i/>
+          <w:color w:val="B8840E"/>
+          <w:sz w:val="17"/>
+        </w:rPr>
+        <w:t xml:space="preserve">  [Control y vigilancia]</w:t>
+      </w:r>
+    </w:p>
+    <w:p>
+      <w:pPr>
+        <w:pStyle w:val="ListBullet"/>
+      </w:pPr>
+      <w:r>
+        <w:rPr>
+          <w:rFonts w:ascii="Calibri" w:hAnsi="Calibri"/>
+          <w:b w:val="0"/>
+          <w:i w:val="0"/>
+          <w:color w:val="1A2238"/>
+          <w:sz w:val="21"/>
+        </w:rPr>
+        <w:t>Separación y reforzamiento del ITP - SANIPES.</w:t>
+      </w:r>
+      <w:r>
+        <w:rPr>
+          <w:rFonts w:ascii="Calibri" w:hAnsi="Calibri"/>
+          <w:b w:val="0"/>
+          <w:i/>
+          <w:color w:val="B8840E"/>
+          <w:sz w:val="17"/>
+        </w:rPr>
+        <w:t xml:space="preserve">  [Reforma institucional]</w:t>
+      </w:r>
+    </w:p>
+    <w:p>
+      <w:pPr>
+        <w:pStyle w:val="ListBullet"/>
+      </w:pPr>
+      <w:r>
+        <w:rPr>
+          <w:rFonts w:ascii="Calibri" w:hAnsi="Calibri"/>
+          <w:b w:val="0"/>
+          <w:i w:val="0"/>
+          <w:color w:val="1A2238"/>
+          <w:sz w:val="21"/>
+        </w:rPr>
+        <w:t>Declarar el quinquenio de la acuicultura en el Perú.</w:t>
+      </w:r>
+      <w:r>
+        <w:rPr>
+          <w:rFonts w:ascii="Calibri" w:hAnsi="Calibri"/>
+          <w:b w:val="0"/>
+          <w:i/>
+          <w:color w:val="B8840E"/>
+          <w:sz w:val="17"/>
+        </w:rPr>
+        <w:t xml:space="preserve">  [Declaratoria / política]</w:t>
+      </w:r>
+    </w:p>
+    <w:p>
+      <w:pPr>
+        <w:pStyle w:val="ListBullet"/>
+      </w:pPr>
+      <w:r>
+        <w:rPr>
+          <w:rFonts w:ascii="Calibri" w:hAnsi="Calibri"/>
+          <w:b w:val="0"/>
+          <w:i w:val="0"/>
+          <w:color w:val="1A2238"/>
+          <w:sz w:val="21"/>
+        </w:rPr>
+        <w:t>Integrar el Instituto Antártico al Instituto del Mar del Perú.</w:t>
+      </w:r>
+      <w:r>
+        <w:rPr>
+          <w:rFonts w:ascii="Calibri" w:hAnsi="Calibri"/>
+          <w:b w:val="0"/>
+          <w:i/>
+          <w:color w:val="B8840E"/>
+          <w:sz w:val="17"/>
+        </w:rPr>
+        <w:t xml:space="preserve">  [Reforma institucional]</w:t>
+      </w:r>
+    </w:p>
+    <w:p>
+      <w:pPr>
+        <w:pStyle w:val="ListBullet"/>
+      </w:pPr>
+      <w:r>
+        <w:rPr>
+          <w:rFonts w:ascii="Calibri" w:hAnsi="Calibri"/>
+          <w:b w:val="0"/>
+          <w:i w:val="0"/>
+          <w:color w:val="1A2238"/>
+          <w:sz w:val="21"/>
+        </w:rPr>
+        <w:t>Promover la implementación de la flota nacional de pesca de altura.</w:t>
+      </w:r>
+      <w:r>
+        <w:rPr>
+          <w:rFonts w:ascii="Calibri" w:hAnsi="Calibri"/>
+          <w:b w:val="0"/>
+          <w:i/>
+          <w:color w:val="B8840E"/>
+          <w:sz w:val="17"/>
+        </w:rPr>
+        <w:t xml:space="preserve">  [Infraestructura productiva]</w:t>
+      </w:r>
+    </w:p>
+    <w:p>
+      <w:pPr>
+        <w:pStyle w:val="ListBullet"/>
+      </w:pPr>
+      <w:r>
+        <w:rPr>
+          <w:rFonts w:ascii="Calibri" w:hAnsi="Calibri"/>
+          <w:b w:val="0"/>
+          <w:i w:val="0"/>
+          <w:color w:val="1A2238"/>
+          <w:sz w:val="21"/>
+        </w:rPr>
+        <w:t>Dinamizar las acciones del sector en la ejecución de programas sociales orientados a incrementar el consumo de pescado.</w:t>
+      </w:r>
+      <w:r>
+        <w:rPr>
+          <w:rFonts w:ascii="Calibri" w:hAnsi="Calibri"/>
+          <w:b w:val="0"/>
+          <w:i/>
+          <w:color w:val="B8840E"/>
+          <w:sz w:val="17"/>
+        </w:rPr>
+        <w:t xml:space="preserve">  [Programa social]</w:t>
+      </w:r>
+    </w:p>
+    <w:p>
+      <w:pPr>
+        <w:pStyle w:val="ListBullet"/>
+      </w:pPr>
+      <w:r>
+        <w:rPr>
+          <w:rFonts w:ascii="Calibri" w:hAnsi="Calibri"/>
+          <w:b w:val="0"/>
+          <w:i w:val="0"/>
+          <w:color w:val="1A2238"/>
+          <w:sz w:val="21"/>
+        </w:rPr>
+        <w:t>Proponer la participación activa del profesional pesquero en la gestión del sector pesquero.</w:t>
+      </w:r>
+      <w:r>
+        <w:rPr>
+          <w:rFonts w:ascii="Calibri" w:hAnsi="Calibri"/>
+          <w:b w:val="0"/>
+          <w:i/>
+          <w:color w:val="B8840E"/>
+          <w:sz w:val="17"/>
+        </w:rPr>
+        <w:t xml:space="preserve">  [Gobernanza / participación]</w:t>
+      </w:r>
+    </w:p>
+    <w:p/>
+    <w:p>
+      <w:r>
+        <w:rPr>
+          <w:rFonts w:ascii="Calibri" w:hAnsi="Calibri"/>
           <w:b w:val="0"/>
           <w:i/>
           <w:color w:val="5D6B88"/>

</xml_diff>